<commit_message>
Arreglo en documentos que se corrompieron
</commit_message>
<xml_diff>
--- a/Docs/Observaciones-Lab 4.docx
+++ b/Docs/Observaciones-Lab 4.docx
@@ -393,9 +393,8 @@
             <w:r>
               <w:rPr>
                 <w:rFonts w:ascii="Dax-Regular" w:hAnsi="Dax-Regular"/>
-                <w:lang w:val="es-419"/>
-              </w:rPr>
-              <w:t>16</w:t>
+              </w:rPr>
+              <w:t>AMD Ryzen 7 7730U with Radeon Graphics (2.00 GHz)</w:t>
             </w:r>
           </w:p>
         </w:tc>
@@ -616,25 +615,7 @@
           <w:bCs/>
           <w:lang w:val="es-419"/>
         </w:rPr>
-        <w:t xml:space="preserve"> para </w:t>
-      </w:r>
-      <w:proofErr w:type="spellStart"/>
-      <w:r>
-        <w:rPr>
-          <w:b/>
-          <w:bCs/>
-          <w:lang w:val="es-419"/>
-        </w:rPr>
-        <w:t>Queue</w:t>
-      </w:r>
-      <w:proofErr w:type="spellEnd"/>
-      <w:r>
-        <w:rPr>
-          <w:b/>
-          <w:bCs/>
-          <w:lang w:val="es-419"/>
-        </w:rPr>
-        <w:t xml:space="preserve"> con Array List</w:t>
+        <w:t xml:space="preserve"> para Queue con Array List</w:t>
       </w:r>
     </w:p>
     <w:p>
@@ -2064,6 +2045,7 @@
                 <w:color w:val="000000"/>
                 <w:lang w:eastAsia="en-US"/>
               </w:rPr>
+              <w:lastRenderedPageBreak/>
               <w:t>50.00%</w:t>
             </w:r>
           </w:p>
@@ -2148,7 +2130,6 @@
                 <w:color w:val="000000"/>
                 <w:lang w:eastAsia="en-US"/>
               </w:rPr>
-              <w:lastRenderedPageBreak/>
               <w:t>80.00%</w:t>
             </w:r>
           </w:p>
@@ -2321,43 +2302,15 @@
           <w:bCs/>
           <w:lang w:val="es-419"/>
         </w:rPr>
-        <w:t xml:space="preserve"> para </w:t>
+        <w:t xml:space="preserve"> para Queue con </w:t>
       </w:r>
-      <w:proofErr w:type="spellStart"/>
       <w:r>
         <w:rPr>
           <w:b/>
           <w:bCs/>
           <w:lang w:val="es-419"/>
         </w:rPr>
-        <w:t>Queue</w:t>
-      </w:r>
-      <w:proofErr w:type="spellEnd"/>
-      <w:r>
-        <w:rPr>
-          <w:b/>
-          <w:bCs/>
-          <w:lang w:val="es-419"/>
-        </w:rPr>
-        <w:t xml:space="preserve"> con </w:t>
-      </w:r>
-      <w:proofErr w:type="spellStart"/>
-      <w:r>
-        <w:rPr>
-          <w:b/>
-          <w:bCs/>
-          <w:lang w:val="es-419"/>
-        </w:rPr>
-        <w:t>Linked</w:t>
-      </w:r>
-      <w:proofErr w:type="spellEnd"/>
-      <w:r>
-        <w:rPr>
-          <w:b/>
-          <w:bCs/>
-          <w:lang w:val="es-419"/>
-        </w:rPr>
-        <w:t xml:space="preserve"> List</w:t>
+        <w:t>Linked List</w:t>
       </w:r>
     </w:p>
     <w:p>
@@ -3250,23 +3203,13 @@
         </w:rPr>
         <w:t xml:space="preserve"> con </w:t>
       </w:r>
-      <w:proofErr w:type="spellStart"/>
       <w:r>
         <w:rPr>
           <w:b/>
           <w:bCs/>
           <w:lang w:val="es-419"/>
         </w:rPr>
-        <w:t>Linked</w:t>
-      </w:r>
-      <w:proofErr w:type="spellEnd"/>
-      <w:r>
-        <w:rPr>
-          <w:b/>
-          <w:bCs/>
-          <w:lang w:val="es-419"/>
-        </w:rPr>
-        <w:t xml:space="preserve"> List</w:t>
+        <w:t>Linked List</w:t>
       </w:r>
     </w:p>
     <w:p>
@@ -4175,25 +4118,7 @@
           <w:bCs/>
           <w:lang w:val="es-419"/>
         </w:rPr>
-        <w:t xml:space="preserve"> para </w:t>
-      </w:r>
-      <w:proofErr w:type="spellStart"/>
-      <w:r>
-        <w:rPr>
-          <w:b/>
-          <w:bCs/>
-          <w:lang w:val="es-419"/>
-        </w:rPr>
-        <w:t>Queue</w:t>
-      </w:r>
-      <w:proofErr w:type="spellEnd"/>
-      <w:r>
-        <w:rPr>
-          <w:b/>
-          <w:bCs/>
-          <w:lang w:val="es-419"/>
-        </w:rPr>
-        <w:t xml:space="preserve"> con Array List</w:t>
+        <w:t xml:space="preserve"> para Queue con Array List</w:t>
       </w:r>
     </w:p>
     <w:p>
@@ -4912,6 +4837,7 @@
                 <w:color w:val="000000"/>
                 <w:lang w:eastAsia="en-US"/>
               </w:rPr>
+              <w:lastRenderedPageBreak/>
               <w:t>50.00%</w:t>
             </w:r>
           </w:p>
@@ -5022,7 +4948,6 @@
                 <w:color w:val="000000"/>
                 <w:lang w:eastAsia="en-US"/>
               </w:rPr>
-              <w:lastRenderedPageBreak/>
               <w:t>80.00%</w:t>
             </w:r>
           </w:p>
@@ -6282,43 +6207,7 @@
           <w:bCs/>
           <w:lang w:val="es-419"/>
         </w:rPr>
-        <w:t xml:space="preserve"> para </w:t>
-      </w:r>
-      <w:proofErr w:type="spellStart"/>
-      <w:r>
-        <w:rPr>
-          <w:b/>
-          <w:bCs/>
-          <w:lang w:val="es-419"/>
-        </w:rPr>
-        <w:t>Queue</w:t>
-      </w:r>
-      <w:proofErr w:type="spellEnd"/>
-      <w:r>
-        <w:rPr>
-          <w:b/>
-          <w:bCs/>
-          <w:lang w:val="es-419"/>
-        </w:rPr>
-        <w:t xml:space="preserve"> con </w:t>
-      </w:r>
-      <w:proofErr w:type="spellStart"/>
-      <w:r>
-        <w:rPr>
-          <w:b/>
-          <w:bCs/>
-          <w:lang w:val="es-419"/>
-        </w:rPr>
-        <w:t>Linked</w:t>
-      </w:r>
-      <w:proofErr w:type="spellEnd"/>
-      <w:r>
-        <w:rPr>
-          <w:b/>
-          <w:bCs/>
-          <w:lang w:val="es-419"/>
-        </w:rPr>
-        <w:t xml:space="preserve"> List</w:t>
+        <w:t xml:space="preserve"> para Queue con Linked List</w:t>
       </w:r>
     </w:p>
     <w:p>
@@ -7401,25 +7290,7 @@
           <w:bCs/>
           <w:lang w:val="es-419"/>
         </w:rPr>
-        <w:t xml:space="preserve"> para Stack con </w:t>
-      </w:r>
-      <w:proofErr w:type="spellStart"/>
-      <w:r>
-        <w:rPr>
-          <w:b/>
-          <w:bCs/>
-          <w:lang w:val="es-419"/>
-        </w:rPr>
-        <w:t>Linked</w:t>
-      </w:r>
-      <w:proofErr w:type="spellEnd"/>
-      <w:r>
-        <w:rPr>
-          <w:b/>
-          <w:bCs/>
-          <w:lang w:val="es-419"/>
-        </w:rPr>
-        <w:t xml:space="preserve"> List</w:t>
+        <w:t xml:space="preserve"> para Stack con Linked List</w:t>
       </w:r>
     </w:p>
     <w:p>
@@ -8405,49 +8276,7 @@
         <w:rPr>
           <w:lang w:val="es-419"/>
         </w:rPr>
-        <w:t xml:space="preserve">¿Se observan diferencias significativas entre las implementaciones con </w:t>
-      </w:r>
-      <w:proofErr w:type="spellStart"/>
-      <w:r>
-        <w:rPr>
-          <w:lang w:val="es-419"/>
-        </w:rPr>
-        <w:t>ArrayList</w:t>
-      </w:r>
-      <w:proofErr w:type="spellEnd"/>
-      <w:r>
-        <w:rPr>
-          <w:lang w:val="es-419"/>
-        </w:rPr>
-        <w:t xml:space="preserve"> y </w:t>
-      </w:r>
-      <w:proofErr w:type="spellStart"/>
-      <w:r>
-        <w:rPr>
-          <w:lang w:val="es-419"/>
-        </w:rPr>
-        <w:t>LinkedList</w:t>
-      </w:r>
-      <w:proofErr w:type="spellEnd"/>
-      <w:r>
-        <w:rPr>
-          <w:lang w:val="es-419"/>
-        </w:rPr>
-        <w:t xml:space="preserve"> para las funciones de </w:t>
-      </w:r>
-      <w:proofErr w:type="spellStart"/>
-      <w:r>
-        <w:rPr>
-          <w:lang w:val="es-419"/>
-        </w:rPr>
-        <w:t>Queue</w:t>
-      </w:r>
-      <w:proofErr w:type="spellEnd"/>
-      <w:r>
-        <w:rPr>
-          <w:lang w:val="es-419"/>
-        </w:rPr>
-        <w:t xml:space="preserve"> y Stack? ¿Cuál es más eficiente en cada operación? ¿Por qué una implementación es más rápida en ciertos casos?</w:t>
+        <w:t>¿Se observan diferencias significativas entre las implementaciones con ArrayList y LinkedList para las funciones de Queue y Stack? ¿Cuál es más eficiente en cada operación? ¿Por qué una implementación es más rápida en ciertos casos?</w:t>
       </w:r>
     </w:p>
     <w:p>
@@ -8472,21 +8301,7 @@
         <w:rPr>
           <w:lang w:val="es-419"/>
         </w:rPr>
-        <w:t>hay diferencias en la mayoría de las implementaciones, estas parecen ser aisladas (</w:t>
-      </w:r>
-      <w:proofErr w:type="spellStart"/>
-      <w:r>
-        <w:rPr>
-          <w:lang w:val="es-419"/>
-        </w:rPr>
-        <w:t>outliers</w:t>
-      </w:r>
-      <w:proofErr w:type="spellEnd"/>
-      <w:r>
-        <w:rPr>
-          <w:lang w:val="es-419"/>
-        </w:rPr>
-        <w:t>). La única</w:t>
+        <w:t>hay diferencias en la mayoría de las implementaciones, estas parecen ser aisladas (outliers). La única</w:t>
       </w:r>
       <w:r>
         <w:rPr>
@@ -8498,61 +8313,19 @@
         <w:rPr>
           <w:lang w:val="es-419"/>
         </w:rPr>
-        <w:t xml:space="preserve">es en </w:t>
-      </w:r>
-      <w:proofErr w:type="spellStart"/>
-      <w:r>
-        <w:rPr>
-          <w:lang w:val="es-419"/>
-        </w:rPr>
-        <w:t>Enqueue</w:t>
-      </w:r>
-      <w:proofErr w:type="spellEnd"/>
-      <w:r>
-        <w:rPr>
-          <w:lang w:val="es-419"/>
-        </w:rPr>
-        <w:t>; donde el uso de un</w:t>
+        <w:t>es en Enqueue; donde el uso de un</w:t>
       </w:r>
       <w:r>
         <w:rPr>
           <w:lang w:val="es-419"/>
         </w:rPr>
-        <w:t xml:space="preserve"> array </w:t>
-      </w:r>
-      <w:proofErr w:type="spellStart"/>
-      <w:r>
-        <w:rPr>
-          <w:lang w:val="es-419"/>
-        </w:rPr>
-        <w:t>list</w:t>
-      </w:r>
-      <w:proofErr w:type="spellEnd"/>
-      <w:r>
-        <w:rPr>
-          <w:lang w:val="es-419"/>
-        </w:rPr>
-        <w:t xml:space="preserve"> es más eficiente a medida que el número de datos incrementa.</w:t>
+        <w:t xml:space="preserve"> array list es más eficiente a medida que el número de datos incrementa.</w:t>
       </w:r>
       <w:r>
         <w:rPr>
           <w:lang w:val="es-419"/>
         </w:rPr>
-        <w:t xml:space="preserve"> Esto podría apuntar a que el uso de </w:t>
-      </w:r>
-      <w:proofErr w:type="spellStart"/>
-      <w:r>
-        <w:rPr>
-          <w:lang w:val="es-419"/>
-        </w:rPr>
-        <w:t>arraylist</w:t>
-      </w:r>
-      <w:proofErr w:type="spellEnd"/>
-      <w:r>
-        <w:rPr>
-          <w:lang w:val="es-419"/>
-        </w:rPr>
-        <w:t xml:space="preserve"> puede ser más eficiente para las colas ya que nos permite usar los índices para acceder rápidamente a los elementos con base a la posición que tienen dentro de la lista nativa de Python. </w:t>
+        <w:t xml:space="preserve"> Esto podría apuntar a que el uso de arraylist puede ser más eficiente para las colas ya que nos permite usar los índices para acceder rápidamente a los elementos con base a la posición que tienen dentro de la lista nativa de Python. </w:t>
       </w:r>
       <w:r>
         <w:rPr>
@@ -8577,35 +8350,7 @@
         <w:rPr>
           <w:lang w:val="es-419"/>
         </w:rPr>
-        <w:t xml:space="preserve">¿Cuándo es preferible usar </w:t>
-      </w:r>
-      <w:proofErr w:type="spellStart"/>
-      <w:r>
-        <w:rPr>
-          <w:lang w:val="es-419"/>
-        </w:rPr>
-        <w:t>ArrayList</w:t>
-      </w:r>
-      <w:proofErr w:type="spellEnd"/>
-      <w:r>
-        <w:rPr>
-          <w:lang w:val="es-419"/>
-        </w:rPr>
-        <w:t xml:space="preserve"> o </w:t>
-      </w:r>
-      <w:proofErr w:type="spellStart"/>
-      <w:r>
-        <w:rPr>
-          <w:lang w:val="es-419"/>
-        </w:rPr>
-        <w:t>LinkedList</w:t>
-      </w:r>
-      <w:proofErr w:type="spellEnd"/>
-      <w:r>
-        <w:rPr>
-          <w:lang w:val="es-419"/>
-        </w:rPr>
-        <w:t>? Si insertamos y eliminamos con frecuencia, ¿qué estructura conviene más? Si accedemos aleatoriamente a elementos, ¿cuál es más eficiente?</w:t>
+        <w:t>¿Cuándo es preferible usar ArrayList o LinkedList? Si insertamos y eliminamos con frecuencia, ¿qué estructura conviene más? Si accedemos aleatoriamente a elementos, ¿cuál es más eficiente?</w:t>
       </w:r>
     </w:p>
     <w:p>
@@ -8624,35 +8369,7 @@
         <w:rPr>
           <w:lang w:val="es-419"/>
         </w:rPr>
-        <w:t xml:space="preserve">Si la idea es insertar y eliminar con frecuencia la mejor opción sería usar una </w:t>
-      </w:r>
-      <w:proofErr w:type="spellStart"/>
-      <w:r>
-        <w:rPr>
-          <w:lang w:val="es-419"/>
-        </w:rPr>
-        <w:t>linked</w:t>
-      </w:r>
-      <w:proofErr w:type="spellEnd"/>
-      <w:r>
-        <w:rPr>
-          <w:lang w:val="es-419"/>
-        </w:rPr>
-        <w:t xml:space="preserve"> </w:t>
-      </w:r>
-      <w:proofErr w:type="spellStart"/>
-      <w:r>
-        <w:rPr>
-          <w:lang w:val="es-419"/>
-        </w:rPr>
-        <w:t>list</w:t>
-      </w:r>
-      <w:proofErr w:type="spellEnd"/>
-      <w:r>
-        <w:rPr>
-          <w:lang w:val="es-419"/>
-        </w:rPr>
-        <w:t xml:space="preserve">, ya que </w:t>
+        <w:t xml:space="preserve">Si la idea es insertar y eliminar con frecuencia la mejor opción sería usar una linked list, ya que </w:t>
       </w:r>
       <w:r>
         <w:rPr>
@@ -8660,67 +8377,17 @@
         </w:rPr>
         <w:t xml:space="preserve">con un </w:t>
       </w:r>
-      <w:proofErr w:type="spellStart"/>
       <w:r>
         <w:rPr>
           <w:lang w:val="es-419"/>
         </w:rPr>
-        <w:t>arraylist</w:t>
-      </w:r>
-      <w:proofErr w:type="spellEnd"/>
-      <w:r>
-        <w:rPr>
-          <w:lang w:val="es-419"/>
-        </w:rPr>
-        <w:t xml:space="preserve"> es más probable que debamos recorrer toda la list</w:t>
+        <w:t>arraylist es más probable que debamos recorrer toda la list</w:t>
       </w:r>
       <w:r>
         <w:rPr>
           <w:lang w:val="es-419"/>
         </w:rPr>
-        <w:t xml:space="preserve">a o incluso reasignar todos los datos a otro espacio en la memoria en caso de que se llene el espacio previamente asignado. Si la idea es acceder aleatoriamente a elementos lo mejor sería usar un </w:t>
-      </w:r>
-      <w:proofErr w:type="spellStart"/>
-      <w:r>
-        <w:rPr>
-          <w:lang w:val="es-419"/>
-        </w:rPr>
-        <w:t>arraylist</w:t>
-      </w:r>
-      <w:proofErr w:type="spellEnd"/>
-      <w:r>
-        <w:rPr>
-          <w:lang w:val="es-419"/>
-        </w:rPr>
-        <w:t xml:space="preserve">, pues el uso de índices permite acceder al elemento en una posición específica sin tener que recorrer todo el arreglo, a diferencia del </w:t>
-      </w:r>
-      <w:proofErr w:type="spellStart"/>
-      <w:r>
-        <w:rPr>
-          <w:lang w:val="es-419"/>
-        </w:rPr>
-        <w:t>linked</w:t>
-      </w:r>
-      <w:proofErr w:type="spellEnd"/>
-      <w:r>
-        <w:rPr>
-          <w:lang w:val="es-419"/>
-        </w:rPr>
-        <w:t xml:space="preserve"> </w:t>
-      </w:r>
-      <w:proofErr w:type="spellStart"/>
-      <w:r>
-        <w:rPr>
-          <w:lang w:val="es-419"/>
-        </w:rPr>
-        <w:t>list</w:t>
-      </w:r>
-      <w:proofErr w:type="spellEnd"/>
-      <w:r>
-        <w:rPr>
-          <w:lang w:val="es-419"/>
-        </w:rPr>
-        <w:t xml:space="preserve">. </w:t>
+        <w:t xml:space="preserve">a o incluso reasignar todos los datos a otro espacio en la memoria en caso de que se llene el espacio previamente asignado. Si la idea es acceder aleatoriamente a elementos lo mejor sería usar un arraylist, pues el uso de índices permite acceder al elemento en una posición específica sin tener que recorrer todo el arreglo, a diferencia del linked list. </w:t>
       </w:r>
       <w:r>
         <w:rPr>
@@ -8770,55 +8437,13 @@
         <w:rPr>
           <w:lang w:val="es-CO"/>
         </w:rPr>
-        <w:t xml:space="preserve">sual en la ejecución de </w:t>
-      </w:r>
-      <w:proofErr w:type="spellStart"/>
-      <w:r>
-        <w:rPr>
-          <w:lang w:val="es-CO"/>
-        </w:rPr>
-        <w:t>peek</w:t>
-      </w:r>
-      <w:proofErr w:type="spellEnd"/>
-      <w:r>
-        <w:rPr>
-          <w:lang w:val="es-CO"/>
-        </w:rPr>
-        <w:t xml:space="preserve"> para </w:t>
+        <w:t xml:space="preserve">sual en la ejecución de peek para </w:t>
       </w:r>
       <w:r>
         <w:rPr>
           <w:lang w:val="es-CO"/>
         </w:rPr>
-        <w:t xml:space="preserve">la </w:t>
-      </w:r>
-      <w:proofErr w:type="spellStart"/>
-      <w:r>
-        <w:rPr>
-          <w:lang w:val="es-CO"/>
-        </w:rPr>
-        <w:t>linked</w:t>
-      </w:r>
-      <w:proofErr w:type="spellEnd"/>
-      <w:r>
-        <w:rPr>
-          <w:lang w:val="es-CO"/>
-        </w:rPr>
-        <w:t xml:space="preserve"> </w:t>
-      </w:r>
-      <w:proofErr w:type="spellStart"/>
-      <w:r>
-        <w:rPr>
-          <w:lang w:val="es-CO"/>
-        </w:rPr>
-        <w:t>list</w:t>
-      </w:r>
-      <w:proofErr w:type="spellEnd"/>
-      <w:r>
-        <w:rPr>
-          <w:lang w:val="es-CO"/>
-        </w:rPr>
-        <w:t xml:space="preserve"> cuando se realizó con el 80% de los datos. Este pico no se puede explicar por el número de datos ya que el tiempo de ejecución es menor tanto para </w:t>
+        <w:t xml:space="preserve">la linked list cuando se realizó con el 80% de los datos. Este pico no se puede explicar por el número de datos ya que el tiempo de ejecución es menor tanto para </w:t>
       </w:r>
       <w:r>
         <w:rPr>
@@ -8965,23 +8590,13 @@
                 <w:lang w:val="es-CO"/>
               </w:rPr>
             </w:pPr>
-            <w:proofErr w:type="spellStart"/>
             <w:r>
               <w:rPr>
                 <w:b w:val="0"/>
                 <w:bCs w:val="0"/>
                 <w:lang w:val="es-CO"/>
               </w:rPr>
-              <w:t>Linked</w:t>
-            </w:r>
-            <w:proofErr w:type="spellEnd"/>
-            <w:r>
-              <w:rPr>
-                <w:b w:val="0"/>
-                <w:bCs w:val="0"/>
-                <w:lang w:val="es-CO"/>
-              </w:rPr>
-              <w:t xml:space="preserve"> List</w:t>
+              <w:t>Linked List</w:t>
             </w:r>
           </w:p>
         </w:tc>
@@ -9052,29 +8667,32 @@
                 <w:lang w:val="es-CO"/>
               </w:rPr>
             </w:pPr>
-            <w:proofErr w:type="spellStart"/>
             <w:r>
               <w:rPr>
                 <w:b/>
                 <w:bCs/>
                 <w:lang w:val="es-CO"/>
               </w:rPr>
-              <w:t>Enqueue</w:t>
-            </w:r>
-            <w:proofErr w:type="spellEnd"/>
-            <w:r>
-              <w:rPr>
-                <w:b/>
-                <w:bCs/>
+              <w:t>Enqueue()</w:t>
+            </w:r>
+          </w:p>
+        </w:tc>
+        <w:tc>
+          <w:tcPr>
+            <w:tcW w:w="1245" w:type="dxa"/>
+          </w:tcPr>
+          <w:p>
+            <w:pPr>
+              <w:cnfStyle w:val="000000100000" w:firstRow="0" w:lastRow="0" w:firstColumn="0" w:lastColumn="0" w:oddVBand="0" w:evenVBand="0" w:oddHBand="1" w:evenHBand="0" w:firstRowFirstColumn="0" w:firstRowLastColumn="0" w:lastRowFirstColumn="0" w:lastRowLastColumn="0"/>
+              <w:rPr>
                 <w:lang w:val="es-CO"/>
               </w:rPr>
-              <w:t>()</w:t>
-            </w:r>
-          </w:p>
-        </w:tc>
-        <w:tc>
-          <w:tcPr>
-            <w:tcW w:w="1245" w:type="dxa"/>
+            </w:pPr>
+          </w:p>
+        </w:tc>
+        <w:tc>
+          <w:tcPr>
+            <w:tcW w:w="1251" w:type="dxa"/>
           </w:tcPr>
           <w:p>
             <w:pPr>
@@ -9083,11 +8701,17 @@
                 <w:lang w:val="es-CO"/>
               </w:rPr>
             </w:pPr>
-          </w:p>
-        </w:tc>
-        <w:tc>
-          <w:tcPr>
-            <w:tcW w:w="1251" w:type="dxa"/>
+            <w:r>
+              <w:rPr>
+                <w:lang w:val="es-CO"/>
+              </w:rPr>
+              <w:t>X</w:t>
+            </w:r>
+          </w:p>
+        </w:tc>
+        <w:tc>
+          <w:tcPr>
+            <w:tcW w:w="4765" w:type="dxa"/>
           </w:tcPr>
           <w:p>
             <w:pPr>
@@ -9100,46 +8724,13 @@
               <w:rPr>
                 <w:lang w:val="es-CO"/>
               </w:rPr>
-              <w:t>X</w:t>
-            </w:r>
-          </w:p>
-        </w:tc>
-        <w:tc>
-          <w:tcPr>
-            <w:tcW w:w="4765" w:type="dxa"/>
-          </w:tcPr>
-          <w:p>
-            <w:pPr>
-              <w:cnfStyle w:val="000000100000" w:firstRow="0" w:lastRow="0" w:firstColumn="0" w:lastColumn="0" w:oddVBand="0" w:evenVBand="0" w:oddHBand="1" w:evenHBand="0" w:firstRowFirstColumn="0" w:firstRowLastColumn="0" w:lastRowFirstColumn="0" w:lastRowLastColumn="0"/>
+              <w:t xml:space="preserve">Esto si está acorde a la teoría, ya que </w:t>
+            </w:r>
+            <w:r>
               <w:rPr>
                 <w:lang w:val="es-CO"/>
               </w:rPr>
-            </w:pPr>
-            <w:r>
-              <w:rPr>
-                <w:lang w:val="es-CO"/>
-              </w:rPr>
-              <w:t xml:space="preserve">Esto si está acorde a la teoría, ya que </w:t>
-            </w:r>
-            <w:r>
-              <w:rPr>
-                <w:lang w:val="es-CO"/>
-              </w:rPr>
-              <w:t xml:space="preserve">solamente debe reasignar un par de punteros a dos nodos (el nuevo head, y el anterior head), a diferencia del array </w:t>
-            </w:r>
-            <w:proofErr w:type="spellStart"/>
-            <w:r>
-              <w:rPr>
-                <w:lang w:val="es-CO"/>
-              </w:rPr>
-              <w:t>list</w:t>
-            </w:r>
-            <w:proofErr w:type="spellEnd"/>
-            <w:r>
-              <w:rPr>
-                <w:lang w:val="es-CO"/>
-              </w:rPr>
-              <w:t xml:space="preserve"> en donde debería desplazar todos los elementos previos. </w:t>
+              <w:t xml:space="preserve">solamente debe reasignar un par de punteros a dos nodos (el nuevo head, y el anterior head), a diferencia del array list en donde debería desplazar todos los elementos previos. </w:t>
             </w:r>
           </w:p>
         </w:tc>
@@ -9175,23 +8766,13 @@
                 <w:lang w:val="es-CO"/>
               </w:rPr>
             </w:pPr>
-            <w:proofErr w:type="spellStart"/>
             <w:r>
               <w:rPr>
                 <w:b/>
                 <w:bCs/>
                 <w:lang w:val="es-CO"/>
               </w:rPr>
-              <w:t>Dequeue</w:t>
-            </w:r>
-            <w:proofErr w:type="spellEnd"/>
-            <w:r>
-              <w:rPr>
-                <w:b/>
-                <w:bCs/>
-                <w:lang w:val="es-CO"/>
-              </w:rPr>
-              <w:t>()</w:t>
+              <w:t>Dequeue()</w:t>
             </w:r>
           </w:p>
         </w:tc>
@@ -9281,29 +8862,32 @@
                 <w:lang w:val="es-CO"/>
               </w:rPr>
             </w:pPr>
-            <w:proofErr w:type="spellStart"/>
             <w:r>
               <w:rPr>
                 <w:b/>
                 <w:bCs/>
                 <w:lang w:val="es-CO"/>
               </w:rPr>
-              <w:t>Peek</w:t>
-            </w:r>
-            <w:proofErr w:type="spellEnd"/>
-            <w:r>
-              <w:rPr>
-                <w:b/>
-                <w:bCs/>
+              <w:t>Peek()</w:t>
+            </w:r>
+          </w:p>
+        </w:tc>
+        <w:tc>
+          <w:tcPr>
+            <w:tcW w:w="1245" w:type="dxa"/>
+          </w:tcPr>
+          <w:p>
+            <w:pPr>
+              <w:cnfStyle w:val="000000100000" w:firstRow="0" w:lastRow="0" w:firstColumn="0" w:lastColumn="0" w:oddVBand="0" w:evenVBand="0" w:oddHBand="1" w:evenHBand="0" w:firstRowFirstColumn="0" w:firstRowLastColumn="0" w:lastRowFirstColumn="0" w:lastRowLastColumn="0"/>
+              <w:rPr>
                 <w:lang w:val="es-CO"/>
               </w:rPr>
-              <w:t>()</w:t>
-            </w:r>
-          </w:p>
-        </w:tc>
-        <w:tc>
-          <w:tcPr>
-            <w:tcW w:w="1245" w:type="dxa"/>
+            </w:pPr>
+          </w:p>
+        </w:tc>
+        <w:tc>
+          <w:tcPr>
+            <w:tcW w:w="1251" w:type="dxa"/>
           </w:tcPr>
           <w:p>
             <w:pPr>
@@ -9312,11 +8896,17 @@
                 <w:lang w:val="es-CO"/>
               </w:rPr>
             </w:pPr>
-          </w:p>
-        </w:tc>
-        <w:tc>
-          <w:tcPr>
-            <w:tcW w:w="1251" w:type="dxa"/>
+            <w:r>
+              <w:rPr>
+                <w:lang w:val="es-CO"/>
+              </w:rPr>
+              <w:t>X</w:t>
+            </w:r>
+          </w:p>
+        </w:tc>
+        <w:tc>
+          <w:tcPr>
+            <w:tcW w:w="4765" w:type="dxa"/>
           </w:tcPr>
           <w:p>
             <w:pPr>
@@ -9329,61 +8919,14 @@
               <w:rPr>
                 <w:lang w:val="es-CO"/>
               </w:rPr>
-              <w:t>X</w:t>
-            </w:r>
-          </w:p>
-        </w:tc>
-        <w:tc>
-          <w:tcPr>
-            <w:tcW w:w="4765" w:type="dxa"/>
-          </w:tcPr>
-          <w:p>
-            <w:pPr>
-              <w:cnfStyle w:val="000000100000" w:firstRow="0" w:lastRow="0" w:firstColumn="0" w:lastColumn="0" w:oddVBand="0" w:evenVBand="0" w:oddHBand="1" w:evenHBand="0" w:firstRowFirstColumn="0" w:firstRowLastColumn="0" w:lastRowFirstColumn="0" w:lastRowLastColumn="0"/>
+              <w:t xml:space="preserve">Realmente la diferencia de tiempos no es tan grande en esta función. Esto sucede porque en ambas se tiene rápido acceso al elemento que se </w:t>
+            </w:r>
+            <w:r>
               <w:rPr>
                 <w:lang w:val="es-CO"/>
               </w:rPr>
-            </w:pPr>
-            <w:r>
-              <w:rPr>
-                <w:lang w:val="es-CO"/>
-              </w:rPr>
-              <w:t xml:space="preserve">Realmente la diferencia de tiempos no es tan grande en esta función. Esto sucede porque en ambas se tiene rápido acceso al elemento que se </w:t>
-            </w:r>
-            <w:r>
-              <w:rPr>
-                <w:lang w:val="es-CO"/>
-              </w:rPr>
               <w:lastRenderedPageBreak/>
-              <w:t xml:space="preserve">retorna en </w:t>
-            </w:r>
-            <w:proofErr w:type="spellStart"/>
-            <w:r>
-              <w:rPr>
-                <w:lang w:val="es-CO"/>
-              </w:rPr>
-              <w:t>peek</w:t>
-            </w:r>
-            <w:proofErr w:type="spellEnd"/>
-            <w:r>
-              <w:rPr>
-                <w:lang w:val="es-CO"/>
-              </w:rPr>
-              <w:t>. Tanto por índice como por el puntero Head (</w:t>
-            </w:r>
-            <w:proofErr w:type="spellStart"/>
-            <w:r>
-              <w:rPr>
-                <w:lang w:val="es-CO"/>
-              </w:rPr>
-              <w:t>first</w:t>
-            </w:r>
-            <w:proofErr w:type="spellEnd"/>
-            <w:r>
-              <w:rPr>
-                <w:lang w:val="es-CO"/>
-              </w:rPr>
-              <w:t>)</w:t>
+              <w:t>retorna en peek. Tanto por índice como por el puntero Head (first)</w:t>
             </w:r>
           </w:p>
         </w:tc>
@@ -9578,35 +9121,7 @@
               <w:rPr>
                 <w:lang w:val="es-CO"/>
               </w:rPr>
-              <w:t xml:space="preserve">En la práctica resulta ser más eficiente el uso de </w:t>
-            </w:r>
-            <w:proofErr w:type="spellStart"/>
-            <w:r>
-              <w:rPr>
-                <w:lang w:val="es-CO"/>
-              </w:rPr>
-              <w:t>Linked</w:t>
-            </w:r>
-            <w:proofErr w:type="spellEnd"/>
-            <w:r>
-              <w:rPr>
-                <w:lang w:val="es-CO"/>
-              </w:rPr>
-              <w:t xml:space="preserve"> </w:t>
-            </w:r>
-            <w:proofErr w:type="spellStart"/>
-            <w:r>
-              <w:rPr>
-                <w:lang w:val="es-CO"/>
-              </w:rPr>
-              <w:t>list</w:t>
-            </w:r>
-            <w:proofErr w:type="spellEnd"/>
-            <w:r>
-              <w:rPr>
-                <w:lang w:val="es-CO"/>
-              </w:rPr>
-              <w:t xml:space="preserve"> para pop. Quizá esto ocurre por el puntero que tiene </w:t>
+              <w:t xml:space="preserve">En la práctica resulta ser más eficiente el uso de Linked list para pop. Quizá esto ocurre por el puntero que tiene </w:t>
             </w:r>
             <w:r>
               <w:rPr>
@@ -12902,116 +12417,12 @@
 </file>
 
 <file path=customXml/item1.xml><?xml version="1.0" encoding="utf-8"?>
-<p:properties xmlns:p="http://schemas.microsoft.com/office/2006/metadata/properties" xmlns:xsi="http://www.w3.org/2001/XMLSchema-instance" xmlns:pc="http://schemas.microsoft.com/office/infopath/2007/PartnerControls">
-  <documentManagement>
-    <SharedWithUsers xmlns="85e30bcc-d76c-4413-8e4d-2dce22fb0743">
-      <UserInfo>
-        <DisplayName>Carlos Andres Lozano Garzon</DisplayName>
-        <AccountId>13</AccountId>
-        <AccountType/>
-      </UserInfo>
-      <UserInfo>
-        <DisplayName>Dario Ernesto Correal Torres</DisplayName>
-        <AccountId>15</AccountId>
-        <AccountType/>
-      </UserInfo>
-      <UserInfo>
-        <DisplayName>Mario  Fernando De la rosa Rosero</DisplayName>
-        <AccountId>16</AccountId>
-        <AccountType/>
-      </UserInfo>
-      <UserInfo>
-        <DisplayName>Christian Camilo Aparicio Baquen</DisplayName>
-        <AccountId>50</AccountId>
-        <AccountType/>
-      </UserInfo>
-      <UserInfo>
-        <DisplayName>Arturo Henao Chaparro</DisplayName>
-        <AccountId>48</AccountId>
-        <AccountType/>
-      </UserInfo>
-      <UserInfo>
-        <DisplayName>Luis Esteban Florez Salamanca</DisplayName>
-        <AccountId>33</AccountId>
-        <AccountType/>
-      </UserInfo>
-      <UserInfo>
-        <DisplayName>Ivan David Salazar Cardenas</DisplayName>
-        <AccountId>52</AccountId>
-        <AccountType/>
-      </UserInfo>
-      <UserInfo>
-        <DisplayName>Juan Carlos Marin Morales</DisplayName>
-        <AccountId>53</AccountId>
-        <AccountType/>
-      </UserInfo>
-      <UserInfo>
-        <DisplayName>Sofia Duque Gomez</DisplayName>
-        <AccountId>60</AccountId>
-        <AccountType/>
-      </UserInfo>
-      <UserInfo>
-        <DisplayName>Andres Felipe Romero Brand</DisplayName>
-        <AccountId>91</AccountId>
-        <AccountType/>
-      </UserInfo>
-      <UserInfo>
-        <DisplayName>Lindsay Vanessa Pinto Morato</DisplayName>
-        <AccountId>92</AccountId>
-        <AccountType/>
-      </UserInfo>
-      <UserInfo>
-        <DisplayName>Miguel Angel Acosta Walteros</DisplayName>
-        <AccountId>94</AccountId>
-        <AccountType/>
-      </UserInfo>
-      <UserInfo>
-        <DisplayName>Juan David Diaz Ipuz</DisplayName>
-        <AccountId>90</AccountId>
-        <AccountType/>
-      </UserInfo>
-      <UserInfo>
-        <DisplayName>Lily Aitana valentina Duque Chavez</DisplayName>
-        <AccountId>17</AccountId>
-        <AccountType/>
-      </UserInfo>
-      <UserInfo>
-        <DisplayName>Isaac David Bermudez Lara</DisplayName>
-        <AccountId>95</AccountId>
-        <AccountType/>
-      </UserInfo>
-      <UserInfo>
-        <DisplayName>Daniel Alejandro Angel Fuertes</DisplayName>
-        <AccountId>55</AccountId>
-        <AccountType/>
-      </UserInfo>
-      <UserInfo>
-        <DisplayName>Jeniffer Liliam Mendoza Espinosa</DisplayName>
-        <AccountId>97</AccountId>
-        <AccountType/>
-      </UserInfo>
-      <UserInfo>
-        <DisplayName>Kevin Cohen Solano</DisplayName>
-        <AccountId>93</AccountId>
-        <AccountType/>
-      </UserInfo>
-      <UserInfo>
-        <DisplayName>Cesar Luis Moreno Gonzalez</DisplayName>
-        <AccountId>96</AccountId>
-        <AccountType/>
-      </UserInfo>
-      <UserInfo>
-        <DisplayName>Jose Cristobal Arroyo Castellanos</DisplayName>
-        <AccountId>54</AccountId>
-        <AccountType/>
-      </UserInfo>
-    </SharedWithUsers>
-    <TaxCatchAll xmlns="85e30bcc-d76c-4413-8e4d-2dce22fb0743" xsi:nil="true"/>
-    <lcf76f155ced4ddcb4097134ff3c332f xmlns="164883f8-7691-4ecf-b54a-664c0d0edefe">
-      <Terms xmlns="http://schemas.microsoft.com/office/infopath/2007/PartnerControls"/>
-    </lcf76f155ced4ddcb4097134ff3c332f>
-  </documentManagement>
-</p:properties>
+<?mso-contentType ?>
+<FormTemplates xmlns="http://schemas.microsoft.com/sharepoint/v3/contenttype/forms">
+  <Display>DocumentLibraryForm</Display>
+  <Edit>DocumentLibraryForm</Edit>
+  <New>DocumentLibraryForm</New>
+</FormTemplates>
 </file>
 
 <file path=customXml/item2.xml><?xml version="1.0" encoding="utf-8"?>
@@ -13264,21 +12675,122 @@
 </file>
 
 <file path=customXml/item3.xml><?xml version="1.0" encoding="utf-8"?>
-<?mso-contentType ?>
-<FormTemplates xmlns="http://schemas.microsoft.com/sharepoint/v3/contenttype/forms">
-  <Display>DocumentLibraryForm</Display>
-  <Edit>DocumentLibraryForm</Edit>
-  <New>DocumentLibraryForm</New>
-</FormTemplates>
+<p:properties xmlns:p="http://schemas.microsoft.com/office/2006/metadata/properties" xmlns:xsi="http://www.w3.org/2001/XMLSchema-instance" xmlns:pc="http://schemas.microsoft.com/office/infopath/2007/PartnerControls">
+  <documentManagement>
+    <SharedWithUsers xmlns="85e30bcc-d76c-4413-8e4d-2dce22fb0743">
+      <UserInfo>
+        <DisplayName>Carlos Andres Lozano Garzon</DisplayName>
+        <AccountId>13</AccountId>
+        <AccountType/>
+      </UserInfo>
+      <UserInfo>
+        <DisplayName>Dario Ernesto Correal Torres</DisplayName>
+        <AccountId>15</AccountId>
+        <AccountType/>
+      </UserInfo>
+      <UserInfo>
+        <DisplayName>Mario  Fernando De la rosa Rosero</DisplayName>
+        <AccountId>16</AccountId>
+        <AccountType/>
+      </UserInfo>
+      <UserInfo>
+        <DisplayName>Christian Camilo Aparicio Baquen</DisplayName>
+        <AccountId>50</AccountId>
+        <AccountType/>
+      </UserInfo>
+      <UserInfo>
+        <DisplayName>Arturo Henao Chaparro</DisplayName>
+        <AccountId>48</AccountId>
+        <AccountType/>
+      </UserInfo>
+      <UserInfo>
+        <DisplayName>Luis Esteban Florez Salamanca</DisplayName>
+        <AccountId>33</AccountId>
+        <AccountType/>
+      </UserInfo>
+      <UserInfo>
+        <DisplayName>Ivan David Salazar Cardenas</DisplayName>
+        <AccountId>52</AccountId>
+        <AccountType/>
+      </UserInfo>
+      <UserInfo>
+        <DisplayName>Juan Carlos Marin Morales</DisplayName>
+        <AccountId>53</AccountId>
+        <AccountType/>
+      </UserInfo>
+      <UserInfo>
+        <DisplayName>Sofia Duque Gomez</DisplayName>
+        <AccountId>60</AccountId>
+        <AccountType/>
+      </UserInfo>
+      <UserInfo>
+        <DisplayName>Andres Felipe Romero Brand</DisplayName>
+        <AccountId>91</AccountId>
+        <AccountType/>
+      </UserInfo>
+      <UserInfo>
+        <DisplayName>Lindsay Vanessa Pinto Morato</DisplayName>
+        <AccountId>92</AccountId>
+        <AccountType/>
+      </UserInfo>
+      <UserInfo>
+        <DisplayName>Miguel Angel Acosta Walteros</DisplayName>
+        <AccountId>94</AccountId>
+        <AccountType/>
+      </UserInfo>
+      <UserInfo>
+        <DisplayName>Juan David Diaz Ipuz</DisplayName>
+        <AccountId>90</AccountId>
+        <AccountType/>
+      </UserInfo>
+      <UserInfo>
+        <DisplayName>Lily Aitana valentina Duque Chavez</DisplayName>
+        <AccountId>17</AccountId>
+        <AccountType/>
+      </UserInfo>
+      <UserInfo>
+        <DisplayName>Isaac David Bermudez Lara</DisplayName>
+        <AccountId>95</AccountId>
+        <AccountType/>
+      </UserInfo>
+      <UserInfo>
+        <DisplayName>Daniel Alejandro Angel Fuertes</DisplayName>
+        <AccountId>55</AccountId>
+        <AccountType/>
+      </UserInfo>
+      <UserInfo>
+        <DisplayName>Jeniffer Liliam Mendoza Espinosa</DisplayName>
+        <AccountId>97</AccountId>
+        <AccountType/>
+      </UserInfo>
+      <UserInfo>
+        <DisplayName>Kevin Cohen Solano</DisplayName>
+        <AccountId>93</AccountId>
+        <AccountType/>
+      </UserInfo>
+      <UserInfo>
+        <DisplayName>Cesar Luis Moreno Gonzalez</DisplayName>
+        <AccountId>96</AccountId>
+        <AccountType/>
+      </UserInfo>
+      <UserInfo>
+        <DisplayName>Jose Cristobal Arroyo Castellanos</DisplayName>
+        <AccountId>54</AccountId>
+        <AccountType/>
+      </UserInfo>
+    </SharedWithUsers>
+    <TaxCatchAll xmlns="85e30bcc-d76c-4413-8e4d-2dce22fb0743" xsi:nil="true"/>
+    <lcf76f155ced4ddcb4097134ff3c332f xmlns="164883f8-7691-4ecf-b54a-664c0d0edefe">
+      <Terms xmlns="http://schemas.microsoft.com/office/infopath/2007/PartnerControls"/>
+    </lcf76f155ced4ddcb4097134ff3c332f>
+  </documentManagement>
+</p:properties>
 </file>
 
 <file path=customXml/itemProps1.xml><?xml version="1.0" encoding="utf-8"?>
-<ds:datastoreItem xmlns:ds="http://schemas.openxmlformats.org/officeDocument/2006/customXml" ds:itemID="{D8D55360-DA4E-4EE6-A532-0D8BE99E30A4}">
+<ds:datastoreItem xmlns:ds="http://schemas.openxmlformats.org/officeDocument/2006/customXml" ds:itemID="{7DBE8262-9C92-4A1B-85FF-A533173B85D6}">
   <ds:schemaRefs>
-    <ds:schemaRef ds:uri="http://schemas.microsoft.com/office/2006/metadata/properties"/>
-    <ds:schemaRef ds:uri="http://schemas.microsoft.com/office/infopath/2007/PartnerControls"/>
-    <ds:schemaRef ds:uri="85e30bcc-d76c-4413-8e4d-2dce22fb0743"/>
-    <ds:schemaRef ds:uri="164883f8-7691-4ecf-b54a-664c0d0edefe"/>
+    <ds:schemaRef ds:uri="http://schemas.microsoft.com/sharepoint/v3/contenttype/forms"/>
   </ds:schemaRefs>
 </ds:datastoreItem>
 </file>
@@ -13303,9 +12815,12 @@
 </file>
 
 <file path=customXml/itemProps3.xml><?xml version="1.0" encoding="utf-8"?>
-<ds:datastoreItem xmlns:ds="http://schemas.openxmlformats.org/officeDocument/2006/customXml" ds:itemID="{7DBE8262-9C92-4A1B-85FF-A533173B85D6}">
+<ds:datastoreItem xmlns:ds="http://schemas.openxmlformats.org/officeDocument/2006/customXml" ds:itemID="{D8D55360-DA4E-4EE6-A532-0D8BE99E30A4}">
   <ds:schemaRefs>
-    <ds:schemaRef ds:uri="http://schemas.microsoft.com/sharepoint/v3/contenttype/forms"/>
+    <ds:schemaRef ds:uri="http://schemas.microsoft.com/office/2006/metadata/properties"/>
+    <ds:schemaRef ds:uri="http://schemas.microsoft.com/office/infopath/2007/PartnerControls"/>
+    <ds:schemaRef ds:uri="85e30bcc-d76c-4413-8e4d-2dce22fb0743"/>
+    <ds:schemaRef ds:uri="164883f8-7691-4ecf-b54a-664c0d0edefe"/>
   </ds:schemaRefs>
 </ds:datastoreItem>
 </file>
</xml_diff>